<commit_message>
Replace strategy presets with free-text prompt, add HTML guides
- Remove Rational/Cooperative/Base-Stock strategy options
- Students now write their own strategy prompt from scratch
- Server always uses custom prompt, removed OBJECTIVES dict
- Added docs/guide-human.html (interactive manual play guide)
- Added docs/guide-ai.html (interactive AI agent guide)
- Updated Anleitung.docx with new strategy flow

Co-Authored-By: Claude Opus 4.6 <noreply@anthropic.com>
</commit_message>
<xml_diff>
--- a/docs/Anleitung.docx
+++ b/docs/Anleitung.docx
@@ -24,7 +24,7 @@
           <w:i/>
           <w:sz w:val="32"/>
         </w:rPr>
-        <w:t>Klassenraum-App mit KI-Agenten</w:t>
+        <w:t>Klassenraum-App mit KI-Agenten oder manuellem Spiel</w:t>
       </w:r>
     </w:p>
     <w:p/>
@@ -313,7 +313,7 @@
           <w:b w:val="0"/>
           <w:i w:val="0"/>
         </w:rPr>
-        <w:t>Diese Web-App ist eine moderne, KI-gestützte Variante des Spiels für den Hörsaal. Studierende spielen nicht selbst jede Woche manuell – sie gestalten stattdessen pro Rolle eine Strategie und lassen einen Claude-KI-Agenten die Bestellungen treffen. Das Ergebnis wird live in Echtzeit auf dem Game-Board und in mehreren Diagrammen angezeigt.</w:t>
+        <w:t>Diese Web-App ist eine moderne Variante des Spiels für den Hörsaal mit zwei Spielmodi: Im KI-Modus gestalten Studierende pro Rolle eine Strategie und lassen einen Claude-KI-Agenten die Bestellungen treffen. Im Human-Modus geben die Studierenden jede Runde manuell ihre Bestellmengen ein – ganz klassisch. In beiden Modi wird das Ergebnis live in Echtzeit auf dem Game-Board und in mehreren Diagrammen angezeigt.</w:t>
       </w:r>
     </w:p>
     <w:p>
@@ -357,7 +357,7 @@
         <w:ind w:left="283"/>
       </w:pPr>
       <w:r>
-        <w:t>KI-Agenten pro Rolle mit wählbarer Strategie oder freiem Custom-Prompt</w:t>
+        <w:t>Zwei Spielmodi: KI-Agenten (Studierende gestalten Strategien) oder Human-Modus (Studierende geben jede Runde manuell Bestellungen ein)</w:t>
       </w:r>
     </w:p>
     <w:p>
@@ -385,6 +385,15 @@
       </w:pPr>
       <w:r>
         <w:t>Preise am Ende: bestes Team + beste*r Spieler*in pro Rolle (nur gewertete Runden)</w:t>
+      </w:r>
+    </w:p>
+    <w:p>
+      <w:pPr>
+        <w:pStyle w:val="ListBullet"/>
+        <w:ind w:left="283"/>
+      </w:pPr>
+      <w:r>
+        <w:t>CSV-Export der Ergebnisse für die Professor*in (Button auf der Ergebnis-Seite)</w:t>
       </w:r>
     </w:p>
     <w:p>
@@ -660,7 +669,7 @@
           <w:b w:val="0"/>
           <w:i w:val="0"/>
         </w:rPr>
-        <w:t>Die erste Seite fragt nach einem Anthropic-API-Key. Dieser wird pro Session im Speicher gehalten und niemals auf die Festplatte geschrieben. Ohne Key kein Spiel – die KI-Agenten nutzen Claude Haiku, um ihre Bestellentscheidungen zu treffen.</w:t>
+        <w:t>Die erste Seite fragt nach einem Anthropic-API-Key. Dieser wird pro Session im Speicher gehalten und niemals auf die Festplatte geschrieben. Im AI-Modus ist der Key zwingend erforderlich – die KI-Agenten nutzen Claude Haiku, um ihre Bestellentscheidungen zu treffen. Im Human-Modus wird kein API-Key benötigt, da die Studierenden selbst bestellen.</w:t>
       </w:r>
     </w:p>
     <w:p>
@@ -741,6 +750,28 @@
                 <w:b/>
               </w:rPr>
               <w:t>Bedeutung</w:t>
+            </w:r>
+          </w:p>
+        </w:tc>
+      </w:tr>
+      <w:tr>
+        <w:tc>
+          <w:tcPr>
+            <w:tcW w:type="dxa" w:w="4873"/>
+          </w:tcPr>
+          <w:p>
+            <w:r>
+              <w:t>Play Mode (Spielmodus)</w:t>
+            </w:r>
+          </w:p>
+        </w:tc>
+        <w:tc>
+          <w:tcPr>
+            <w:tcW w:type="dxa" w:w="4873"/>
+          </w:tcPr>
+          <w:p>
+            <w:r>
+              <w:t>„AI Agents“ (Standard): KI-Agenten treffen Bestellentscheidungen basierend auf Studierenden-Strategien. „Human Players“: Studierende geben jede Runde manuell ihre Bestellmengen ein – kein API-Key nötig.</w:t>
             </w:r>
           </w:p>
         </w:tc>
@@ -1151,7 +1182,7 @@
           <w:b w:val="0"/>
           <w:i w:val="0"/>
         </w:rPr>
-        <w:t>In dieser Phase sehen die Studierenden pro Rolle eine Auswahl an Strategien (z.B. rational, vorsichtig, aggressiv, anti-bullwhip) oder die Option „Custom“ mit freiem Prompt-Feld. Der Prompt wird später bei jeder Agenten-Entscheidung als System-Anweisung an Claude geschickt.</w:t>
+        <w:t>Diese Phase gibt es nur im AI-Modus. Die Studierenden schreiben pro Rolle einen eigenen Strategie-Prompt als Freitext – es gibt keine vorgefertigten Strategien. Der Prompt wird später bei jeder Agenten-Entscheidung als Anweisung an Claude geschickt. Beispiele: „Bestelle immer genau die Nachfrage“, „Halte einen Sicherheitsbestand von 5 Einheiten“, etc. Im Human-Modus wird diese Phase übersprungen – das Spiel startet direkt.</w:t>
       </w:r>
     </w:p>
     <w:p>
@@ -1435,7 +1466,7 @@
         <w:pStyle w:val="ListNumber"/>
       </w:pPr>
       <w:r>
-        <w:t>Nach Start: Team- und Rollen-Info wird angezeigt; pro Rolle eine Strategie wählen oder Custom-Prompt schreiben</w:t>
+        <w:t>Nach Start: Team- und Rollen-Info wird angezeigt</w:t>
       </w:r>
     </w:p>
     <w:p>
@@ -1443,7 +1474,16 @@
         <w:pStyle w:val="ListNumber"/>
       </w:pPr>
       <w:r>
-        <w:t>„Lock In“ drücken</w:t>
+        <w:t xml:space="preserve">Im </w:t>
+      </w:r>
+      <w:r>
+        <w:rPr>
+          <w:b/>
+        </w:rPr>
+        <w:t>AI-Modus</w:t>
+      </w:r>
+      <w:r>
+        <w:t>: Pro Rolle einen eigenen Strategie-Prompt schreiben, „Lock In“ drücken, dann „I’m Ready“. Spiel läuft automatisch – Game-Board beobachten, Reasoning-Sprechblasen lesen.</w:t>
       </w:r>
     </w:p>
     <w:p>
@@ -1451,23 +1491,16 @@
         <w:pStyle w:val="ListNumber"/>
       </w:pPr>
       <w:r>
-        <w:t>Ready-Screen: „I'm Ready – Start Game“ drücken, wenn bereit</w:t>
+        <w:t xml:space="preserve">Im </w:t>
       </w:r>
-    </w:p>
-    <w:p>
-      <w:pPr>
-        <w:pStyle w:val="ListNumber"/>
-      </w:pPr>
       <w:r>
-        <w:t>Warten, bis alle anderen auch Ready gedrückt haben</w:t>
+        <w:rPr>
+          <w:b/>
+        </w:rPr>
+        <w:t>Human-Modus</w:t>
       </w:r>
-    </w:p>
-    <w:p>
-      <w:pPr>
-        <w:pStyle w:val="ListNumber"/>
-      </w:pPr>
       <w:r>
-        <w:t>Spiel läuft automatisch – Game-Board beobachten, Reasoning-Sprechblasen lesen</w:t>
+        <w:t>: Keine Agent-Design-Phase. Jede Runde erscheint unter der Simulation ein Eingabe-Panel mit Demand, Inventory, Backlog und Pipeline pro Rolle. Bestellmenge eingeben und „Submit Orders“ drücken. Die Runde wird verarbeitet, sobald alle Spieler*innen ihre Bestellungen abgeschickt haben.</w:t>
       </w:r>
     </w:p>
     <w:p>
@@ -1523,7 +1556,7 @@
           <w:sz w:val="19"/>
           <w:shd w:val="clear" w:color="auto" w:fill="F2F2F2"/>
         </w:rPr>
-        <w:t>/Users/benrickert/Desktop/in class game/</w:t>
+        <w:t>/Users/benrickert/Desktop/Beer Game/</w:t>
       </w:r>
     </w:p>
     <w:p>
@@ -1872,7 +1905,7 @@
           <w:sz w:val="19"/>
           <w:shd w:val="clear" w:color="auto" w:fill="F2F2F2"/>
         </w:rPr>
-        <w:t>cd "/Users/benrickert/Desktop/in class game"</w:t>
+        <w:t>cd "/Users/benrickert/Desktop/Beer Game"</w:t>
       </w:r>
     </w:p>
     <w:p>
@@ -2070,7 +2103,7 @@
           </w:tcPr>
           <w:p>
             <w:r>
-              <w:t>Symlink zum eigentlichen Code-Repo „in class game“ auf dem Desktop. Dort liegen server.py, static/index.html, render.yaml, .github/, etc.</w:t>
+              <w:t>Das eigentliche Code-Repository. Dort liegen server.py, static/index.html, render.yaml, .github/, etc.</w:t>
             </w:r>
           </w:p>
         </w:tc>

</xml_diff>